<commit_message>
docs: final pack for t11 (selected), Kohei Kudo, Week 2 rank 2; video guidance from the competition page (D84)
Co-Authored-By: Claude Sonnet 5.5 <noreply@anthropic.com>
Claude-Session: https://claude.ai/code/session_015FJt2Qsv88cxtF8e7yXTQp
</commit_message>
<xml_diff>
--- a/docs/final/writeup.docx
+++ b/docs/final/writeup.docx
@@ -16,7 +16,7 @@
         <w:pStyle w:val="FirstParagraph"/>
       </w:pPr>
       <w:r>
-        <w:t xml:space="preserve">Team: [TEAM NAME]; members: [TEAM MEMBERS’ NAMES]. Repository:</w:t>
+        <w:t xml:space="preserve">Team: Kohei Kudo; members: Kohei Kudo (sole member). Repository:</w:t>
       </w:r>
       <w:r>
         <w:t xml:space="preserve"> </w:t>
@@ -147,7 +147,17 @@
               <w:jc w:val="left"/>
             </w:pPr>
             <w:r>
-              <w:t xml:space="preserve">0.16462 for the final ensemble, from 0.16077 for the first (eleven submissions; the last seven, 0.16450 to 0.16474, differ by less than the noise of the public board; the best single file, 0.16474, is within 0.00012 of the final).</w:t>
+              <w:t xml:space="preserve">0.16458 for the final ensemble (selected on Kaggle), from 0.16077 for the first (twelve submissions; the last eight, 0.16450 to 0.16474, differ by less than the noise of the public board; the best single file, 0.16474, is within 0.00016 of the final).</w:t>
+            </w:r>
+            <w:r>
+              <w:t xml:space="preserve"> </w:t>
+            </w:r>
+            <w:r>
+              <w:rPr>
+                <w:bCs/>
+                <w:b/>
+              </w:rPr>
+              <w:t xml:space="preserve">Week 2 private leaderboard: rank 2; Week 1: rank 3 of 54.</w:t>
             </w:r>
           </w:p>
         </w:tc>
@@ -173,7 +183,7 @@
               <w:jc w:val="left"/>
             </w:pPr>
             <w:r>
-              <w:t xml:space="preserve">Pooled D2 0.1408 forward (calibrate 2023, score 2024) and 0.1272 reverse for the final ensemble (0.1397 / 0.1271 before ensembling), against 0.1110 forward for a model fitted on the emerging data alone.</w:t>
+              <w:t xml:space="preserve">Pooled D2 0.1405 forward (calibrate 2023, score 2024) and 0.1268 reverse for the final ensemble (0.1397 / 0.1271 before ensembling), against 0.1110 forward for a model fitted on the emerging data alone.</w:t>
             </w:r>
           </w:p>
         </w:tc>
@@ -1292,7 +1302,7 @@
               <w:jc w:val="left"/>
             </w:pPr>
             <w:r>
-              <w:t xml:space="preserve">+ ensemble of 3 tree bases, 6 nets and 4 Tweedie fits (final)</w:t>
+              <w:t xml:space="preserve">+ ensemble of 5 tree bases, 7 nets and 4 Tweedie fits (final, file p2_t11)</w:t>
             </w:r>
           </w:p>
         </w:tc>
@@ -1308,7 +1318,7 @@
                 <w:bCs/>
                 <w:b/>
               </w:rPr>
-              <w:t xml:space="preserve">0.1408</w:t>
+              <w:t xml:space="preserve">0.1405</w:t>
             </w:r>
           </w:p>
         </w:tc>
@@ -1324,7 +1334,7 @@
                 <w:bCs/>
                 <w:b/>
               </w:rPr>
-              <w:t xml:space="preserve">0.1272</w:t>
+              <w:t xml:space="preserve">0.1268</w:t>
             </w:r>
           </w:p>
         </w:tc>
@@ -1340,7 +1350,7 @@
                 <w:bCs/>
                 <w:b/>
               </w:rPr>
-              <w:t xml:space="preserve">0.16462</w:t>
+              <w:t xml:space="preserve">0.16458</w:t>
             </w:r>
           </w:p>
         </w:tc>
@@ -1351,7 +1361,7 @@
         <w:pStyle w:val="BodyText"/>
       </w:pPr>
       <w:r>
-        <w:t xml:space="preserve">The ensemble averages members with equal weights inside each group (single-seed and 3-seed fits, 4- and 8-leaf trees, three net families); it is variance reduction, not a tuned gain: the public differences among the last seven candidates are 0.00024 or less. Checks that bound what more tuning could give: a simulation of the level method with a known truth (400 simulated books per scenario; the robust level beats a plain line closure in every scenario, RESULTS 76-78) and a ceiling analysis (a perfect line level would add at most 0.005 D2, RESULTS 84); a search for remaining feature structure found none beyond the gender factor (973 levels, RESULTS 79). Local figures are on the two emerging training years, public figures on the 2025 test rows (a different population: 76% new business); only the ordering is comparable.</w:t>
+        <w:t xml:space="preserve">The ensemble averages members with equal weights inside each group (single-seed and 3-seed fits, 4- and 8-leaf trees, three net families); it is variance reduction, not a tuned gain: the public differences among the last eight candidates are 0.00024 or less (a smaller ensemble of 3 tree bases, 6 nets and 4 Tweedie fits scored 0.1408 / 0.1272 locally and 0.16462 publicly; the larger one was selected for its wider composition). Checks that bound what more tuning could give: a simulation of the level method with a known truth (400 simulated books per scenario; the robust level beats a plain line closure in every scenario, RESULTS 76-78) and a ceiling analysis (a perfect line level would add at most 0.005 D2, RESULTS 84); a search for remaining feature structure found none beyond the gender factor (973 levels, RESULTS 79). Local figures are on the two emerging training years, public figures on the 2025 test rows (a different population: 76% new business); only the ordering is comparable.</w:t>
       </w:r>
     </w:p>
     <w:p>

</xml_diff>

<commit_message>
feat: one-line storyline per scene, slide and report section; deck, video and write-up rebuilt
Co-Authored-By: Claude Sonnet 5.5 <noreply@anthropic.com>
Claude-Session: https://claude.ai/code/session_015FJt2Qsv88cxtF8e7yXTQp
</commit_message>
<xml_diff>
--- a/docs/final/writeup.docx
+++ b/docs/final/writeup.docx
@@ -50,6 +50,18 @@
       </w:pPr>
       <w:r>
         <w:t xml:space="preserve">1. Summary</w:t>
+      </w:r>
+    </w:p>
+    <w:p>
+      <w:pPr>
+        <w:pStyle w:val="FirstParagraph"/>
+      </w:pPr>
+      <w:r>
+        <w:rPr>
+          <w:iCs/>
+          <w:i/>
+        </w:rPr>
+        <w:t xml:space="preserve">In one line: Two markets, one engine: rank 3 in Week 1 and rank 2 in Week 2, by keeping what transfers and re-measuring what does not.</w:t>
       </w:r>
     </w:p>
     <w:tbl>
@@ -244,6 +256,18 @@
       </w:pPr>
       <w:r>
         <w:t xml:space="preserve">2. What changed in the new market</w:t>
+      </w:r>
+    </w:p>
+    <w:p>
+      <w:pPr>
+        <w:pStyle w:val="FirstParagraph"/>
+      </w:pPr>
+      <w:r>
+        <w:rPr>
+          <w:iCs/>
+          <w:i/>
+        </w:rPr>
+        <w:t xml:space="preserve">In one line: The emerging book differs by peril, severity scale and customer mix (76% new business), so one level factor is not enough.</w:t>
       </w:r>
     </w:p>
     <w:tbl>
@@ -658,6 +682,18 @@
     </w:p>
     <w:p>
       <w:pPr>
+        <w:pStyle w:val="FirstParagraph"/>
+      </w:pPr>
+      <w:r>
+        <w:rPr>
+          <w:iCs/>
+          <w:i/>
+        </w:rPr>
+        <w:t xml:space="preserve">In one line: The developed market decides who is risky; the emerging book decides how much, with a gender factor on top.</w:t>
+      </w:r>
+    </w:p>
+    <w:p>
+      <w:pPr>
         <w:numPr>
           <w:ilvl w:val="0"/>
           <w:numId w:val="1001"/>
@@ -841,6 +877,18 @@
     <w:p>
       <w:pPr>
         <w:pStyle w:val="FirstParagraph"/>
+      </w:pPr>
+      <w:r>
+        <w:rPr>
+          <w:iCs/>
+          <w:i/>
+        </w:rPr>
+        <w:t xml:space="preserve">In one line: Every change is kept only if neither time direction gets worse; more than thirty ideas failed that test.</w:t>
+      </w:r>
+    </w:p>
+    <w:p>
+      <w:pPr>
+        <w:pStyle w:val="BodyText"/>
       </w:pPr>
       <w:r>
         <w:rPr>
@@ -1413,6 +1461,18 @@
         <w:t xml:space="preserve">5. Uncertainty</w:t>
       </w:r>
     </w:p>
+    <w:p>
+      <w:pPr>
+        <w:pStyle w:val="FirstParagraph"/>
+      </w:pPr>
+      <w:r>
+        <w:rPr>
+          <w:iCs/>
+          <w:i/>
+        </w:rPr>
+        <w:t xml:space="preserve">In one line: The ranking of risks transfers; the level, above all for buildings, is what two years of data cannot pin down.</w:t>
+      </w:r>
+    </w:p>
     <w:tbl>
       <w:tblPr>
         <w:tblStyle w:val="Table"/>
@@ -1631,6 +1691,18 @@
     </w:p>
     <w:p>
       <w:pPr>
+        <w:pStyle w:val="FirstParagraph"/>
+      </w:pPr>
+      <w:r>
+        <w:rPr>
+          <w:iCs/>
+          <w:i/>
+        </w:rPr>
+        <w:t xml:space="preserve">In one line: AI did the legwork across the workflow; tests, a blind second agent and recorded checks caught its errors.</w:t>
+      </w:r>
+    </w:p>
+    <w:p>
+      <w:pPr>
         <w:numPr>
           <w:ilvl w:val="0"/>
           <w:numId w:val="1002"/>
@@ -1774,6 +1846,18 @@
         <w:pStyle w:val="FirstParagraph"/>
       </w:pPr>
       <w:r>
+        <w:rPr>
+          <w:iCs/>
+          <w:i/>
+        </w:rPr>
+        <w:t xml:space="preserve">In one line: Automated tests, a leak alarm, reproducibility checks and 84 recorded decisions make every number traceable.</w:t>
+      </w:r>
+    </w:p>
+    <w:p>
+      <w:pPr>
+        <w:pStyle w:val="BodyText"/>
+      </w:pPr>
+      <w:r>
         <w:t xml:space="preserve">Automated: 125 tests on every push (CI), fail-fast data bands for the repairs, a leak alarm (pooled D2 above 0.35 stops a run;</w:t>
       </w:r>
       <w:r>
@@ -1832,6 +1916,18 @@
     <w:p>
       <w:pPr>
         <w:pStyle w:val="FirstParagraph"/>
+      </w:pPr>
+      <w:r>
+        <w:rPr>
+          <w:iCs/>
+          <w:i/>
+        </w:rPr>
+        <w:t xml:space="preserve">In one line: How a predicted claim cost becomes an office premium for 20 reference policies, and why the loadings matter.</w:t>
+      </w:r>
+    </w:p>
+    <w:p>
+      <w:pPr>
+        <w:pStyle w:val="BodyText"/>
       </w:pPr>
       <w:r>
         <w:t xml:space="preserve">Office premium = (risk + 12% x risk for property + 85 x exposure) / (1 - 15% variable - commission 20% broker or 0% direct - 8% tax - 8% margin),</w:t>
@@ -2509,6 +2605,18 @@
         <w:pStyle w:val="FirstParagraph"/>
       </w:pPr>
       <w:r>
+        <w:rPr>
+          <w:iCs/>
+          <w:i/>
+        </w:rPr>
+        <w:t xml:space="preserve">In one line: What two emerging years, a 76% new-business test book and a gender factor cannot support.</w:t>
+      </w:r>
+    </w:p>
+    <w:p>
+      <w:pPr>
+        <w:pStyle w:val="BodyText"/>
+      </w:pPr>
+      <w:r>
         <w:t xml:space="preserve">Two emerging years; 76% of the test book is new business and has no claim history; the buildings level is uncertain by a factor that the validation cannot narrow; gender rating may not be permissible outside this competition; the construction code MIX and the developed claim-reporting pattern are assumptions that tested neutral; the public leaderboard score (0.16474) is on a different population from our validation and is used only as a level check.</w:t>
       </w:r>
     </w:p>
@@ -2532,6 +2640,18 @@
     <w:p>
       <w:pPr>
         <w:pStyle w:val="FirstParagraph"/>
+      </w:pPr>
+      <w:r>
+        <w:rPr>
+          <w:iCs/>
+          <w:i/>
+        </w:rPr>
+        <w:t xml:space="preserve">In one line: Where to find the evidence in the repository.</w:t>
+      </w:r>
+    </w:p>
+    <w:p>
+      <w:pPr>
+        <w:pStyle w:val="BodyText"/>
       </w:pPr>
       <w:r>
         <w:rPr>

</xml_diff>

<commit_message>
feat: real phone footage (Claude Code remote control + voice), final ensemble structure scene, Week 2 private result removed, tools stated
Co-Authored-By: Claude Sonnet 5.5 <noreply@anthropic.com>
Claude-Session: https://claude.ai/code/session_015FJt2Qsv88cxtF8e7yXTQp
</commit_message>
<xml_diff>
--- a/docs/final/writeup.docx
+++ b/docs/final/writeup.docx
@@ -61,7 +61,7 @@
           <w:iCs/>
           <w:i/>
         </w:rPr>
-        <w:t xml:space="preserve">In one line: Two markets, one engine: rank 3 in Week 1 and rank 2 in Week 2, by keeping what transfers and re-measuring what does not.</w:t>
+        <w:t xml:space="preserve">In one line: Two markets, one engine: rank 3 in Week 1 (final) and a public score of 0.16458 in Week 2, by keeping what transfers and re-measuring what does not.</w:t>
       </w:r>
     </w:p>
     <w:tbl>
@@ -160,16 +160,6 @@
             </w:pPr>
             <w:r>
               <w:t xml:space="preserve">0.16458 for the final ensemble (selected on Kaggle), from 0.16077 for the first (twelve submissions; the last eight, 0.16450 to 0.16474, differ by less than the noise of the public board; the best single file, 0.16474, is within 0.00016 of the final).</w:t>
-            </w:r>
-            <w:r>
-              <w:t xml:space="preserve"> </w:t>
-            </w:r>
-            <w:r>
-              <w:rPr>
-                <w:bCs/>
-                <w:b/>
-              </w:rPr>
-              <w:t xml:space="preserve">Week 2 private leaderboard: rank 2; Week 1: rank 3 of 54.</w:t>
             </w:r>
           </w:p>
         </w:tc>
@@ -698,7 +688,6 @@
           <w:ilvl w:val="0"/>
           <w:numId w:val="1001"/>
         </w:numPr>
-        <w:pStyle w:val="Compact"/>
       </w:pPr>
       <w:r>
         <w:rPr>
@@ -738,7 +727,6 @@
           <w:ilvl w:val="0"/>
           <w:numId w:val="1001"/>
         </w:numPr>
-        <w:pStyle w:val="Compact"/>
       </w:pPr>
       <w:r>
         <w:rPr>
@@ -782,20 +770,162 @@
           <w:ilvl w:val="0"/>
           <w:numId w:val="1001"/>
         </w:numPr>
-        <w:pStyle w:val="Compact"/>
       </w:pPr>
       <w:r>
         <w:rPr>
           <w:bCs/>
           <w:b/>
         </w:rPr>
-        <w:t xml:space="preserve">Base blend</w:t>
-      </w:r>
-      <w:r>
-        <w:t xml:space="preserve"> </w:t>
-      </w:r>
-      <w:r>
-        <w:t xml:space="preserve">(the Part 1 recipe): 50% frequency-by-severity GBM, 25% direct pure-premium Tweedie GBM (two settings), 25% two neural nets (TabM and TabM-PLE), all with the history inputs.</w:t>
+        <w:t xml:space="preserve">Final ensemble</w:t>
+      </w:r>
+      <w:r>
+        <w:t xml:space="preserve"> </w:t>
+      </w:r>
+      <w:r>
+        <w:t xml:space="preserve">(16 members, all with the history inputs, trained on the developed market 2021-24; the file</w:t>
+      </w:r>
+      <w:r>
+        <w:t xml:space="preserve"> </w:t>
+      </w:r>
+      <w:r>
+        <w:rPr>
+          <w:rStyle w:val="VerbatimChar"/>
+        </w:rPr>
+        <w:t xml:space="preserve">p2_t11_ensemble_e3.csv</w:t>
+      </w:r>
+      <w:r>
+        <w:t xml:space="preserve">). Members are averaged with equal weights inside each group; the groups carry 37.5% (trees), 37.5% (nets) and 25% (direct Tweedie GBMs) of the base:</w:t>
+      </w:r>
+    </w:p>
+    <w:tbl>
+      <w:tblPr>
+        <w:tblStyle w:val="Table"/>
+        <w:tblW w:type="pct" w:w="5000"/>
+        <w:tblLook w:firstRow="1" w:lastRow="0" w:firstColumn="0" w:lastColumn="0" w:noHBand="0" w:noVBand="0" w:val="0020"/>
+        <w:jc w:val="start"/>
+        <w:tblInd w:w="720" w:type="dxa"/>
+      </w:tblPr>
+      <w:tblGrid>
+        <w:gridCol w:w="3960"/>
+        <w:gridCol w:w="3960"/>
+      </w:tblGrid>
+      <w:tr>
+        <w:trPr>
+          <w:tblHeader w:val="true"/>
+        </w:trPr>
+        <w:tc>
+          <w:tcPr/>
+          <w:p>
+            <w:pPr>
+              <w:pStyle w:val="Compact"/>
+              <w:jc w:val="left"/>
+            </w:pPr>
+            <w:r>
+              <w:t xml:space="preserve">Group (weight)</w:t>
+            </w:r>
+          </w:p>
+        </w:tc>
+        <w:tc>
+          <w:tcPr/>
+          <w:p>
+            <w:pPr>
+              <w:pStyle w:val="Compact"/>
+              <w:jc w:val="left"/>
+            </w:pPr>
+            <w:r>
+              <w:t xml:space="preserve">Members (weight in the base)</w:t>
+            </w:r>
+          </w:p>
+        </w:tc>
+      </w:tr>
+      <w:tr>
+        <w:tc>
+          <w:tcPr/>
+          <w:p>
+            <w:pPr>
+              <w:pStyle w:val="Compact"/>
+              <w:jc w:val="left"/>
+            </w:pPr>
+            <w:r>
+              <w:t xml:space="preserve">Frequency x severity tree models (37.5%)</w:t>
+            </w:r>
+          </w:p>
+        </w:tc>
+        <w:tc>
+          <w:tcPr/>
+          <w:p>
+            <w:pPr>
+              <w:pStyle w:val="Compact"/>
+              <w:jc w:val="left"/>
+            </w:pPr>
+            <w:r>
+              <w:t xml:space="preserve">LightGBM 4 leaves; LightGBM 4 leaves, 3 seeds; LightGBM 8 leaves; LightGBM 4 leaves with 70% column sampling; XGBoost depth 3 (7.5% each)</w:t>
+            </w:r>
+          </w:p>
+        </w:tc>
+      </w:tr>
+      <w:tr>
+        <w:tc>
+          <w:tcPr/>
+          <w:p>
+            <w:pPr>
+              <w:pStyle w:val="Compact"/>
+              <w:jc w:val="left"/>
+            </w:pPr>
+            <w:r>
+              <w:t xml:space="preserve">Frequency x severity neural nets (37.5%)</w:t>
+            </w:r>
+          </w:p>
+        </w:tc>
+        <w:tc>
+          <w:tcPr/>
+          <w:p>
+            <w:pPr>
+              <w:pStyle w:val="Compact"/>
+              <w:jc w:val="left"/>
+            </w:pPr>
+            <w:r>
+              <w:t xml:space="preserve">TabM; TabM 3 seeds; TabM-PLE; TabM-PLE 3 seeds; TabM-quantile; TabM-quantile 3 seeds; TabM wider (5.4% each)</w:t>
+            </w:r>
+          </w:p>
+        </w:tc>
+      </w:tr>
+      <w:tr>
+        <w:tc>
+          <w:tcPr/>
+          <w:p>
+            <w:pPr>
+              <w:pStyle w:val="Compact"/>
+              <w:jc w:val="left"/>
+            </w:pPr>
+            <w:r>
+              <w:t xml:space="preserve">Direct pure-premium Tweedie GBMs (25%)</w:t>
+            </w:r>
+          </w:p>
+        </w:tc>
+        <w:tc>
+          <w:tcPr/>
+          <w:p>
+            <w:pPr>
+              <w:pStyle w:val="Compact"/>
+              <w:jc w:val="left"/>
+            </w:pPr>
+            <w:r>
+              <w:t xml:space="preserve">4 leaves; 8 leaves; 4 leaves 3 seeds; 8 leaves 3 seeds (6.25% each)</w:t>
+            </w:r>
+          </w:p>
+        </w:tc>
+      </w:tr>
+    </w:tbl>
+    <w:p>
+      <w:pPr>
+        <w:numPr>
+          <w:ilvl w:val="0"/>
+          <w:numId w:val="1000"/>
+        </w:numPr>
+      </w:pPr>
+      <w:r>
+        <w:t xml:space="preserve">That is 28 fitted model sets per line (a 3-seed member counts three times). The ensemble is variance reduction, not a tuned gain: a 13-member version scored the same within noise (RESULTS 87-88).</w:t>
       </w:r>
     </w:p>
     <w:p>
@@ -804,7 +934,6 @@
           <w:ilvl w:val="0"/>
           <w:numId w:val="1001"/>
         </w:numPr>
-        <w:pStyle w:val="Compact"/>
       </w:pPr>
       <w:r>
         <w:rPr>
@@ -848,7 +977,6 @@
           <w:ilvl w:val="0"/>
           <w:numId w:val="1001"/>
         </w:numPr>
-        <w:pStyle w:val="Compact"/>
       </w:pPr>
       <w:r>
         <w:rPr>
@@ -1699,6 +1827,73 @@
           <w:i/>
         </w:rPr>
         <w:t xml:space="preserve">In one line: AI did the legwork across the workflow; tests, a blind second agent and recorded checks caught its errors.</w:t>
+      </w:r>
+    </w:p>
+    <w:p>
+      <w:pPr>
+        <w:numPr>
+          <w:ilvl w:val="0"/>
+          <w:numId w:val="1002"/>
+        </w:numPr>
+        <w:pStyle w:val="Compact"/>
+      </w:pPr>
+      <w:r>
+        <w:rPr>
+          <w:bCs/>
+          <w:b/>
+        </w:rPr>
+        <w:t xml:space="preserve">Tools, stated plainly:</w:t>
+      </w:r>
+      <w:r>
+        <w:t xml:space="preserve"> </w:t>
+      </w:r>
+      <w:r>
+        <w:t xml:space="preserve">the whole workflow ran in</w:t>
+      </w:r>
+      <w:r>
+        <w:t xml:space="preserve"> </w:t>
+      </w:r>
+      <w:r>
+        <w:rPr>
+          <w:bCs/>
+          <w:b/>
+        </w:rPr>
+        <w:t xml:space="preserve">Claude Code</w:t>
+      </w:r>
+      <w:r>
+        <w:t xml:space="preserve"> </w:t>
+      </w:r>
+      <w:r>
+        <w:t xml:space="preserve">(Anthropic’s agentic coding assistant; the app showed Sonnet 5.5) in cloud sessions, which I controlled</w:t>
+      </w:r>
+      <w:r>
+        <w:t xml:space="preserve"> </w:t>
+      </w:r>
+      <w:r>
+        <w:rPr>
+          <w:bCs/>
+          <w:b/>
+        </w:rPr>
+        <w:t xml:space="preserve">remotely from the Claude app on my phone</w:t>
+      </w:r>
+      <w:r>
+        <w:t xml:space="preserve">, giving most instructions by</w:t>
+      </w:r>
+      <w:r>
+        <w:t xml:space="preserve"> </w:t>
+      </w:r>
+      <w:r>
+        <w:rPr>
+          <w:bCs/>
+          <w:b/>
+        </w:rPr>
+        <w:t xml:space="preserve">voice dictation</w:t>
+      </w:r>
+      <w:r>
+        <w:t xml:space="preserve"> </w:t>
+      </w:r>
+      <w:r>
+        <w:t xml:space="preserve">(speech to text in the app). Part of Week 2 was modelled this way, on a bus, with no laptop; the demo video shows my own screen recordings of it.</w:t>
       </w:r>
     </w:p>
     <w:p>

</xml_diff>